<commit_message>
Remove private WCCRM repo link and CV content notes
The WCCRM repository is private, so the Wolds Record card now links only
to the live app and no longer names the repo. This applies to the CV
page, the DOCX build script, and both downloads. The internal content
notes for review are removed from the page along with their styles.

Co-Authored-By: Claude Opus 5.5 <noreply@anthropic.com>
</commit_message>
<xml_diff>
--- a/public/cv/Ben-Whitfield-Heap-CV.docx
+++ b/public/cv/Ben-Whitfield-Heap-CV.docx
@@ -415,7 +415,7 @@
               </w:rPr>
               <w:t>LIVE SAAS</w:t>
               <w:br/>
-              <w:t>WCCRM / AI-built SaaS</w:t>
+              <w:t>AI-built SaaS</w:t>
             </w:r>
           </w:p>
         </w:tc>
@@ -440,7 +440,7 @@
                 <w:color w:val="102A2F"/>
                 <w:sz w:val="18"/>
               </w:rPr>
-              <w:t>The live Wolds Record app, alongside WCCRM, the SaaS product I built solo with AI.</w:t>
+              <w:t>The live Wolds Record app, a SaaS product I built solo with AI.</w:t>
             </w:r>
           </w:p>
           <w:p>
@@ -456,25 +456,6 @@
                   <w:u w:val="single"/>
                 </w:rPr>
                 <w:t>Open app</w:t>
-              </w:r>
-            </w:hyperlink>
-            <w:r>
-              <w:rPr>
-                <w:rFonts w:ascii="Consolas" w:hAnsi="Consolas"/>
-                <w:color w:val="536467"/>
-                <w:sz w:val="14"/>
-              </w:rPr>
-              <w:t xml:space="preserve">  ·  </w:t>
-            </w:r>
-            <w:hyperlink r:id="rId15">
-              <w:r>
-                <w:rPr>
-                  <w:rFonts w:ascii="Calibri" w:hAnsi="Calibri"/>
-                  <w:color w:val="0E5E64"/>
-                  <w:sz w:val="16"/>
-                  <w:u w:val="single"/>
-                </w:rPr>
-                <w:t>WCCRM on GitHub</w:t>
               </w:r>
             </w:hyperlink>
           </w:p>
@@ -552,7 +533,7 @@
             <w:pPr>
               <w:spacing w:after="0"/>
             </w:pPr>
-            <w:hyperlink r:id="rId16">
+            <w:hyperlink r:id="rId15">
               <w:r>
                 <w:rPr>
                   <w:rFonts w:ascii="Calibri" w:hAnsi="Calibri"/>
@@ -638,7 +619,7 @@
             <w:pPr>
               <w:spacing w:after="0"/>
             </w:pPr>
-            <w:hyperlink r:id="rId17">
+            <w:hyperlink r:id="rId16">
               <w:r>
                 <w:rPr>
                   <w:rFonts w:ascii="Calibri" w:hAnsi="Calibri"/>
@@ -657,7 +638,7 @@
               </w:rPr>
               <w:t xml:space="preserve">  ·  </w:t>
             </w:r>
-            <w:hyperlink r:id="rId18">
+            <w:hyperlink r:id="rId17">
               <w:r>
                 <w:rPr>
                   <w:rFonts w:ascii="Calibri" w:hAnsi="Calibri"/>
@@ -743,7 +724,7 @@
             <w:pPr>
               <w:spacing w:after="0"/>
             </w:pPr>
-            <w:hyperlink r:id="rId19">
+            <w:hyperlink r:id="rId18">
               <w:r>
                 <w:rPr>
                   <w:rFonts w:ascii="Calibri" w:hAnsi="Calibri"/>
@@ -829,7 +810,7 @@
             <w:pPr>
               <w:spacing w:after="0"/>
             </w:pPr>
-            <w:hyperlink r:id="rId20">
+            <w:hyperlink r:id="rId19">
               <w:r>
                 <w:rPr>
                   <w:rFonts w:ascii="Calibri" w:hAnsi="Calibri"/>
@@ -848,7 +829,7 @@
               </w:rPr>
               <w:t xml:space="preserve">  ·  </w:t>
             </w:r>
-            <w:hyperlink r:id="rId21">
+            <w:hyperlink r:id="rId20">
               <w:r>
                 <w:rPr>
                   <w:rFonts w:ascii="Calibri" w:hAnsi="Calibri"/>
@@ -934,7 +915,7 @@
             <w:pPr>
               <w:spacing w:after="0"/>
             </w:pPr>
-            <w:hyperlink r:id="rId22">
+            <w:hyperlink r:id="rId21">
               <w:r>
                 <w:rPr>
                   <w:rFonts w:ascii="Calibri" w:hAnsi="Calibri"/>
@@ -953,7 +934,7 @@
               </w:rPr>
               <w:t xml:space="preserve">  ·  </w:t>
             </w:r>
-            <w:hyperlink r:id="rId23">
+            <w:hyperlink r:id="rId22">
               <w:r>
                 <w:rPr>
                   <w:rFonts w:ascii="Calibri" w:hAnsi="Calibri"/>
@@ -1481,7 +1462,7 @@
         <w:pStyle w:val="CVContext"/>
         <w:keepNext w:val="1"/>
       </w:pPr>
-      <w:hyperlink r:id="rId24">
+      <w:hyperlink r:id="rId23">
         <w:r>
           <w:rPr>
             <w:rFonts w:ascii="Calibri" w:hAnsi="Calibri"/>

</xml_diff>